<commit_message>
pdf actualizado y terminado
</commit_message>
<xml_diff>
--- a/Memoria Proyecto final Julian_Jiale.docx
+++ b/Memoria Proyecto final Julian_Jiale.docx
@@ -11,133 +11,55 @@
           <w:szCs w:val="32"/>
         </w:rPr>
       </w:pPr>
-      <w:proofErr w:type="spellStart"/>
       <w:r>
         <w:rPr>
           <w:color w:val="5B9BD5" w:themeColor="accent1"/>
           <w:sz w:val="32"/>
           <w:szCs w:val="32"/>
         </w:rPr>
-        <w:t>LeidMotivs</w:t>
-      </w:r>
-      <w:proofErr w:type="spellEnd"/>
+        <w:t>Leitmotiv</w:t>
+      </w:r>
+      <w:bookmarkStart w:id="0" w:name="_GoBack"/>
+      <w:bookmarkEnd w:id="0"/>
       <w:r>
         <w:rPr>
           <w:color w:val="5B9BD5" w:themeColor="accent1"/>
           <w:sz w:val="32"/>
           <w:szCs w:val="32"/>
         </w:rPr>
-        <w:t xml:space="preserve"> en </w:t>
-      </w:r>
-      <w:proofErr w:type="spellStart"/>
-      <w:r>
-        <w:rPr>
-          <w:color w:val="5B9BD5" w:themeColor="accent1"/>
-          <w:sz w:val="32"/>
-          <w:szCs w:val="32"/>
-        </w:rPr>
-        <w:t>videojuegosç</w:t>
-      </w:r>
-      <w:proofErr w:type="spellEnd"/>
-    </w:p>
-    <w:p>
-      <w:pPr>
-        <w:rPr>
-          <w:sz w:val="32"/>
-          <w:szCs w:val="32"/>
-        </w:rPr>
-      </w:pPr>
-      <w:r>
+        <w:t xml:space="preserve"> en videojuegos</w:t>
+      </w:r>
+    </w:p>
+    <w:p>
+      <w:pPr>
+        <w:jc w:val="center"/>
         <w:rPr>
           <w:b/>
           <w:bCs/>
           <w:sz w:val="32"/>
           <w:szCs w:val="32"/>
-        </w:rPr>
-        <w:t>Descripción</w:t>
-      </w:r>
-    </w:p>
-    <w:p>
-      <w:pPr>
-        <w:rPr>
-          <w:sz w:val="32"/>
-          <w:szCs w:val="32"/>
-        </w:rPr>
-      </w:pPr>
-    </w:p>
-    <w:p>
-      <w:pPr>
-        <w:rPr>
-          <w:sz w:val="28"/>
-          <w:szCs w:val="28"/>
-        </w:rPr>
-      </w:pPr>
-      <w:r>
-        <w:rPr>
-          <w:sz w:val="28"/>
-          <w:szCs w:val="28"/>
-        </w:rPr>
-        <w:t xml:space="preserve">En este proyecto vamos a adaptar un </w:t>
-      </w:r>
-      <w:proofErr w:type="spellStart"/>
-      <w:r>
-        <w:rPr>
-          <w:sz w:val="28"/>
-          <w:szCs w:val="28"/>
-        </w:rPr>
-        <w:t>Leadmotiv</w:t>
-      </w:r>
-      <w:proofErr w:type="spellEnd"/>
-      <w:r>
-        <w:rPr>
-          <w:sz w:val="28"/>
-          <w:szCs w:val="28"/>
-        </w:rPr>
-        <w:t xml:space="preserve"> original a varios estilos y contextos musicales que se pueden dar en un videojuego.  </w:t>
-      </w:r>
-    </w:p>
-    <w:p>
-      <w:pPr>
-        <w:rPr>
-          <w:sz w:val="28"/>
-          <w:szCs w:val="28"/>
-        </w:rPr>
-      </w:pPr>
-      <w:r>
-        <w:rPr>
-          <w:sz w:val="28"/>
-          <w:szCs w:val="28"/>
-        </w:rPr>
-        <w:t>La idea es acompañar las composiciones musicales con un apoyo visual, ya sea un videojuego o una animación, la música se adaptará al entorno conforme este varíe, ajustándose al contexto actual, así si el personaje se encuentra en una pradera el motivo sonará más tranquila y ambiental que si se encontrase en una mansión encantada donde sonaría t</w:t>
-      </w:r>
-      <w:r>
-        <w:rPr>
-          <w:sz w:val="28"/>
-          <w:szCs w:val="28"/>
-        </w:rPr>
-        <w:t>o</w:t>
-      </w:r>
-      <w:r>
-        <w:rPr>
-          <w:sz w:val="28"/>
-          <w:szCs w:val="28"/>
-        </w:rPr>
-        <w:t>do más tenso y tétrico.</w:t>
-      </w:r>
-    </w:p>
-    <w:p>
-      <w:pPr>
-        <w:rPr>
-          <w:sz w:val="32"/>
-          <w:szCs w:val="32"/>
-        </w:rPr>
-      </w:pPr>
-    </w:p>
-    <w:p>
-      <w:pPr>
-        <w:rPr>
-          <w:sz w:val="32"/>
-          <w:szCs w:val="32"/>
+          <w:u w:val="single"/>
+        </w:rPr>
+      </w:pPr>
+      <w:hyperlink r:id="rId7" w:history="1">
+        <w:r>
+          <w:rPr>
+            <w:rStyle w:val="Hipervnculo"/>
+            <w:b/>
+            <w:bCs/>
+            <w:sz w:val="32"/>
+            <w:szCs w:val="32"/>
+          </w:rPr>
+          <w:t>Repositorio con todos los archivos</w:t>
+        </w:r>
+      </w:hyperlink>
+    </w:p>
+    <w:p>
+      <w:pPr>
+        <w:rPr>
+          <w:sz w:val="32"/>
+          <w:szCs w:val="32"/>
+          <w:u w:val="single"/>
         </w:rPr>
       </w:pPr>
       <w:r>
@@ -147,45 +69,65 @@
           <w:sz w:val="32"/>
           <w:szCs w:val="32"/>
         </w:rPr>
-        <w:t>Contexto del juego</w:t>
-      </w:r>
-    </w:p>
-    <w:p>
-      <w:pPr>
-        <w:rPr>
-          <w:sz w:val="32"/>
-          <w:szCs w:val="32"/>
-        </w:rPr>
-      </w:pPr>
-    </w:p>
-    <w:p>
-      <w:pPr>
-        <w:rPr>
-          <w:sz w:val="28"/>
-          <w:szCs w:val="28"/>
-        </w:rPr>
-      </w:pPr>
-      <w:r>
-        <w:rPr>
-          <w:sz w:val="28"/>
-          <w:szCs w:val="28"/>
-        </w:rPr>
-        <w:t>En este Juego controlarás a un protagonista en un RPG de aventuras en el cual visitarás múltiples mundos y realidades a través de portales, para que cada portal se cree vas a necesitar pelear contra múltiples enemigos e investigar diversos mundos en busca de las piedras que sirven para llegar a nuevas zonas.  </w:t>
-      </w:r>
-    </w:p>
-    <w:p>
-      <w:pPr>
-        <w:rPr>
-          <w:sz w:val="28"/>
-          <w:szCs w:val="28"/>
-        </w:rPr>
-      </w:pPr>
-      <w:r>
-        <w:rPr>
-          <w:sz w:val="28"/>
-          <w:szCs w:val="28"/>
-        </w:rPr>
-        <w:t>Bajo este contexto tendremos que sonorizar diferentes peleas con música enérgica para las peleas y diferentes estilos musicales para ambientar cada zona de cada mundo visitado.</w:t>
+        <w:t>Descripción</w:t>
+      </w:r>
+    </w:p>
+    <w:p>
+      <w:pPr>
+        <w:rPr>
+          <w:sz w:val="28"/>
+          <w:szCs w:val="28"/>
+        </w:rPr>
+      </w:pPr>
+      <w:r>
+        <w:rPr>
+          <w:sz w:val="28"/>
+          <w:szCs w:val="28"/>
+        </w:rPr>
+        <w:t xml:space="preserve">En este proyecto vamos a adaptar un </w:t>
+      </w:r>
+      <w:r>
+        <w:rPr>
+          <w:sz w:val="28"/>
+          <w:szCs w:val="28"/>
+        </w:rPr>
+        <w:t>Leitmotiv</w:t>
+      </w:r>
+      <w:r>
+        <w:rPr>
+          <w:sz w:val="28"/>
+          <w:szCs w:val="28"/>
+        </w:rPr>
+        <w:t xml:space="preserve"> original a varios estilos y contextos musicales que se pueden dar en un videojuego.  </w:t>
+      </w:r>
+    </w:p>
+    <w:p>
+      <w:pPr>
+        <w:rPr>
+          <w:sz w:val="28"/>
+          <w:szCs w:val="28"/>
+        </w:rPr>
+      </w:pPr>
+      <w:r>
+        <w:rPr>
+          <w:sz w:val="28"/>
+          <w:szCs w:val="28"/>
+        </w:rPr>
+        <w:t>La idea es acompañar las composiciones musicales con un apoyo visual, ya sea un videojuego o una animación, la música se adaptará al entorno conforme este varíe, ajustándose al contexto actual, así si el personaje se encuentra en una pradera el motivo sonará más tranquila y ambiental que si se encontrase en una mansión encantada donde sonaría t</w:t>
+      </w:r>
+      <w:r>
+        <w:rPr>
+          <w:sz w:val="28"/>
+          <w:szCs w:val="28"/>
+        </w:rPr>
+        <w:t>o</w:t>
+      </w:r>
+      <w:r>
+        <w:rPr>
+          <w:sz w:val="28"/>
+          <w:szCs w:val="28"/>
+        </w:rPr>
+        <w:t>do más tenso y tétrico.</w:t>
       </w:r>
     </w:p>
     <w:p>
@@ -210,9 +152,54 @@
           <w:sz w:val="32"/>
           <w:szCs w:val="32"/>
         </w:rPr>
-        <w:t xml:space="preserve">Análisis del </w:t>
-      </w:r>
-      <w:proofErr w:type="spellStart"/>
+        <w:t>Contexto del juego</w:t>
+      </w:r>
+    </w:p>
+    <w:p>
+      <w:pPr>
+        <w:rPr>
+          <w:sz w:val="28"/>
+          <w:szCs w:val="28"/>
+        </w:rPr>
+      </w:pPr>
+      <w:r>
+        <w:rPr>
+          <w:sz w:val="28"/>
+          <w:szCs w:val="28"/>
+        </w:rPr>
+        <w:t>En este Juego controlarás a un protagonista en un RPG de aventuras en el cual visitarás múltiples mundos y realidades a través de portales, para que cada portal se cree vas a necesitar pelear contra múltiples enemigos e investigar diversos mundos en busca de las piedras que sirven para llegar a nuevas zonas.  </w:t>
+      </w:r>
+    </w:p>
+    <w:p>
+      <w:pPr>
+        <w:rPr>
+          <w:sz w:val="28"/>
+          <w:szCs w:val="28"/>
+        </w:rPr>
+      </w:pPr>
+      <w:r>
+        <w:rPr>
+          <w:sz w:val="28"/>
+          <w:szCs w:val="28"/>
+        </w:rPr>
+        <w:t>Bajo este contexto tendremos que sonorizar diferentes peleas con música enérgica para las peleas y diferentes estilos musicales para ambientar cada zona de cada mundo visitado.</w:t>
+      </w:r>
+    </w:p>
+    <w:p>
+      <w:pPr>
+        <w:rPr>
+          <w:sz w:val="32"/>
+          <w:szCs w:val="32"/>
+        </w:rPr>
+      </w:pPr>
+    </w:p>
+    <w:p>
+      <w:pPr>
+        <w:rPr>
+          <w:sz w:val="32"/>
+          <w:szCs w:val="32"/>
+        </w:rPr>
+      </w:pPr>
       <w:r>
         <w:rPr>
           <w:b/>
@@ -220,168 +207,9 @@
           <w:sz w:val="32"/>
           <w:szCs w:val="32"/>
         </w:rPr>
-        <w:t>Leidmotiv</w:t>
-      </w:r>
-      <w:proofErr w:type="spellEnd"/>
-    </w:p>
-    <w:p>
-      <w:pPr>
-        <w:rPr>
-          <w:sz w:val="32"/>
-          <w:szCs w:val="32"/>
-        </w:rPr>
-      </w:pPr>
-    </w:p>
-    <w:p>
-      <w:pPr>
-        <w:rPr>
-          <w:sz w:val="32"/>
-          <w:szCs w:val="32"/>
-        </w:rPr>
-      </w:pPr>
-      <w:r>
-        <w:rPr>
-          <w:sz w:val="32"/>
-          <w:szCs w:val="32"/>
-        </w:rPr>
-        <w:t xml:space="preserve">Hemos decidido darle un carácter animado a la melodía inspirándonos en los motivos de </w:t>
-      </w:r>
-      <w:proofErr w:type="spellStart"/>
-      <w:r>
-        <w:rPr>
-          <w:sz w:val="32"/>
-          <w:szCs w:val="32"/>
-        </w:rPr>
-        <w:t>flowey</w:t>
-      </w:r>
-      <w:proofErr w:type="spellEnd"/>
-      <w:r>
-        <w:rPr>
-          <w:sz w:val="32"/>
-          <w:szCs w:val="32"/>
-        </w:rPr>
-        <w:t xml:space="preserve"> de </w:t>
-      </w:r>
-      <w:proofErr w:type="spellStart"/>
-      <w:r>
-        <w:rPr>
-          <w:sz w:val="32"/>
-          <w:szCs w:val="32"/>
-        </w:rPr>
-        <w:t>Undertale</w:t>
-      </w:r>
-      <w:proofErr w:type="spellEnd"/>
-      <w:r>
-        <w:rPr>
-          <w:sz w:val="32"/>
-          <w:szCs w:val="32"/>
-        </w:rPr>
-        <w:t xml:space="preserve">, </w:t>
-      </w:r>
-      <w:proofErr w:type="spellStart"/>
-      <w:r>
-        <w:rPr>
-          <w:sz w:val="32"/>
-          <w:szCs w:val="32"/>
-        </w:rPr>
-        <w:t>green</w:t>
-      </w:r>
-      <w:proofErr w:type="spellEnd"/>
-      <w:r>
-        <w:rPr>
-          <w:sz w:val="32"/>
-          <w:szCs w:val="32"/>
-        </w:rPr>
-        <w:t xml:space="preserve"> </w:t>
-      </w:r>
-      <w:proofErr w:type="spellStart"/>
-      <w:r>
-        <w:rPr>
-          <w:sz w:val="32"/>
-          <w:szCs w:val="32"/>
-        </w:rPr>
-        <w:t>greens</w:t>
-      </w:r>
-      <w:proofErr w:type="spellEnd"/>
-      <w:r>
-        <w:rPr>
-          <w:sz w:val="32"/>
-          <w:szCs w:val="32"/>
-        </w:rPr>
-        <w:t xml:space="preserve"> o gourmet </w:t>
-      </w:r>
-      <w:proofErr w:type="spellStart"/>
-      <w:r>
-        <w:rPr>
-          <w:sz w:val="32"/>
-          <w:szCs w:val="32"/>
-        </w:rPr>
-        <w:t>race</w:t>
-      </w:r>
-      <w:proofErr w:type="spellEnd"/>
-      <w:r>
-        <w:rPr>
-          <w:sz w:val="32"/>
-          <w:szCs w:val="32"/>
-        </w:rPr>
-        <w:t xml:space="preserve"> de </w:t>
-      </w:r>
-      <w:proofErr w:type="spellStart"/>
-      <w:r>
-        <w:rPr>
-          <w:sz w:val="32"/>
-          <w:szCs w:val="32"/>
-        </w:rPr>
-        <w:t>kirby</w:t>
-      </w:r>
-      <w:proofErr w:type="spellEnd"/>
-      <w:r>
-        <w:rPr>
-          <w:sz w:val="32"/>
-          <w:szCs w:val="32"/>
-        </w:rPr>
-        <w:t xml:space="preserve"> o </w:t>
-      </w:r>
-      <w:proofErr w:type="spellStart"/>
-      <w:r>
-        <w:rPr>
-          <w:sz w:val="32"/>
-          <w:szCs w:val="32"/>
-        </w:rPr>
-        <w:t>melodias</w:t>
-      </w:r>
-      <w:proofErr w:type="spellEnd"/>
-      <w:r>
-        <w:rPr>
-          <w:sz w:val="32"/>
-          <w:szCs w:val="32"/>
-        </w:rPr>
-        <w:t xml:space="preserve"> para niños como estrellita dónde estás, para ello vamos a compones en una escala mayor una melodía pegadiza y alegre, para ello hemos hecho </w:t>
-      </w:r>
-      <w:r>
-        <w:rPr>
-          <w:sz w:val="32"/>
-          <w:szCs w:val="32"/>
-        </w:rPr>
-        <w:lastRenderedPageBreak/>
-        <w:t>una melodía que salta constantemente entre notas del acorde con un ritmo rápido y con muchas corcheas y semicorcheas seguidas para darle ese carácter juguetón.</w:t>
-      </w:r>
-    </w:p>
-    <w:p>
-      <w:pPr>
-        <w:rPr>
-          <w:sz w:val="32"/>
-          <w:szCs w:val="32"/>
-        </w:rPr>
-      </w:pPr>
-    </w:p>
-    <w:p>
-      <w:pPr>
-        <w:rPr>
-          <w:sz w:val="32"/>
-          <w:szCs w:val="32"/>
-        </w:rPr>
-      </w:pPr>
+        <w:t xml:space="preserve">Análisis del </w:t>
+      </w:r>
+      <w:proofErr w:type="spellStart"/>
       <w:r>
         <w:rPr>
           <w:b/>
@@ -389,111 +217,248 @@
           <w:sz w:val="32"/>
           <w:szCs w:val="32"/>
         </w:rPr>
-        <w:t>Estilos a adaptar</w:t>
-      </w:r>
-    </w:p>
-    <w:p>
-      <w:pPr>
-        <w:rPr>
-          <w:sz w:val="32"/>
-          <w:szCs w:val="32"/>
-        </w:rPr>
-      </w:pPr>
-    </w:p>
-    <w:p>
-      <w:pPr>
-        <w:rPr>
-          <w:sz w:val="28"/>
-          <w:szCs w:val="28"/>
-        </w:rPr>
-      </w:pPr>
-      <w:r>
-        <w:rPr>
-          <w:sz w:val="28"/>
-          <w:szCs w:val="28"/>
-        </w:rPr>
-        <w:t>- Combate/tensión en distintas intensidades</w:t>
-      </w:r>
-    </w:p>
-    <w:p>
-      <w:pPr>
-        <w:rPr>
-          <w:sz w:val="28"/>
-          <w:szCs w:val="28"/>
-        </w:rPr>
-      </w:pPr>
-      <w:r>
-        <w:rPr>
-          <w:sz w:val="28"/>
-          <w:szCs w:val="28"/>
-        </w:rPr>
-        <w:t>- Selva tropical</w:t>
-      </w:r>
-    </w:p>
-    <w:p>
-      <w:pPr>
-        <w:rPr>
-          <w:sz w:val="28"/>
-          <w:szCs w:val="28"/>
-        </w:rPr>
-      </w:pPr>
-      <w:r>
-        <w:rPr>
-          <w:sz w:val="28"/>
-          <w:szCs w:val="28"/>
-        </w:rPr>
-        <w:t>- Espacial</w:t>
-      </w:r>
-    </w:p>
-    <w:p>
-      <w:pPr>
-        <w:rPr>
-          <w:sz w:val="28"/>
-          <w:szCs w:val="28"/>
-        </w:rPr>
-      </w:pPr>
-      <w:r>
-        <w:rPr>
-          <w:sz w:val="28"/>
-          <w:szCs w:val="28"/>
-        </w:rPr>
-        <w:t>- Bosque</w:t>
-      </w:r>
-    </w:p>
-    <w:p>
-      <w:pPr>
-        <w:rPr>
-          <w:sz w:val="32"/>
-          <w:szCs w:val="32"/>
-        </w:rPr>
-      </w:pPr>
-    </w:p>
-    <w:p>
-      <w:pPr>
+        <w:t>Leidmotiv</w:t>
+      </w:r>
+      <w:proofErr w:type="spellEnd"/>
+    </w:p>
+    <w:p>
+      <w:pPr>
+        <w:rPr>
+          <w:sz w:val="32"/>
+          <w:szCs w:val="32"/>
+        </w:rPr>
+      </w:pPr>
+      <w:r>
+        <w:rPr>
+          <w:sz w:val="32"/>
+          <w:szCs w:val="32"/>
+        </w:rPr>
+        <w:t xml:space="preserve">Hemos decidido darle un carácter animado a la melodía inspirándonos en los motivos de </w:t>
+      </w:r>
+      <w:proofErr w:type="spellStart"/>
+      <w:r>
+        <w:rPr>
+          <w:sz w:val="32"/>
+          <w:szCs w:val="32"/>
+        </w:rPr>
+        <w:t>flowey</w:t>
+      </w:r>
+      <w:proofErr w:type="spellEnd"/>
+      <w:r>
+        <w:rPr>
+          <w:sz w:val="32"/>
+          <w:szCs w:val="32"/>
+        </w:rPr>
+        <w:t xml:space="preserve"> de </w:t>
+      </w:r>
+      <w:proofErr w:type="spellStart"/>
+      <w:r>
+        <w:rPr>
+          <w:sz w:val="32"/>
+          <w:szCs w:val="32"/>
+        </w:rPr>
+        <w:t>Undertale</w:t>
+      </w:r>
+      <w:proofErr w:type="spellEnd"/>
+      <w:r>
+        <w:rPr>
+          <w:sz w:val="32"/>
+          <w:szCs w:val="32"/>
+        </w:rPr>
+        <w:t xml:space="preserve">, </w:t>
+      </w:r>
+      <w:proofErr w:type="spellStart"/>
+      <w:r>
+        <w:rPr>
+          <w:sz w:val="32"/>
+          <w:szCs w:val="32"/>
+        </w:rPr>
+        <w:t>green</w:t>
+      </w:r>
+      <w:proofErr w:type="spellEnd"/>
+      <w:r>
+        <w:rPr>
+          <w:sz w:val="32"/>
+          <w:szCs w:val="32"/>
+        </w:rPr>
+        <w:t xml:space="preserve"> </w:t>
+      </w:r>
+      <w:proofErr w:type="spellStart"/>
+      <w:r>
+        <w:rPr>
+          <w:sz w:val="32"/>
+          <w:szCs w:val="32"/>
+        </w:rPr>
+        <w:t>greens</w:t>
+      </w:r>
+      <w:proofErr w:type="spellEnd"/>
+      <w:r>
+        <w:rPr>
+          <w:sz w:val="32"/>
+          <w:szCs w:val="32"/>
+        </w:rPr>
+        <w:t xml:space="preserve"> o gourmet </w:t>
+      </w:r>
+      <w:proofErr w:type="spellStart"/>
+      <w:r>
+        <w:rPr>
+          <w:sz w:val="32"/>
+          <w:szCs w:val="32"/>
+        </w:rPr>
+        <w:t>race</w:t>
+      </w:r>
+      <w:proofErr w:type="spellEnd"/>
+      <w:r>
+        <w:rPr>
+          <w:sz w:val="32"/>
+          <w:szCs w:val="32"/>
+        </w:rPr>
+        <w:t xml:space="preserve"> de </w:t>
+      </w:r>
+      <w:proofErr w:type="spellStart"/>
+      <w:r>
+        <w:rPr>
+          <w:sz w:val="32"/>
+          <w:szCs w:val="32"/>
+        </w:rPr>
+        <w:t>kirby</w:t>
+      </w:r>
+      <w:proofErr w:type="spellEnd"/>
+      <w:r>
+        <w:rPr>
+          <w:sz w:val="32"/>
+          <w:szCs w:val="32"/>
+        </w:rPr>
+        <w:t xml:space="preserve"> o </w:t>
+      </w:r>
+      <w:proofErr w:type="spellStart"/>
+      <w:r>
+        <w:rPr>
+          <w:sz w:val="32"/>
+          <w:szCs w:val="32"/>
+        </w:rPr>
+        <w:t>melodias</w:t>
+      </w:r>
+      <w:proofErr w:type="spellEnd"/>
+      <w:r>
+        <w:rPr>
+          <w:sz w:val="32"/>
+          <w:szCs w:val="32"/>
+        </w:rPr>
+        <w:t xml:space="preserve"> para niños como estrellita dónde estás, para ello vamos a compones en una escala mayor una melodía pegadiza y alegre, para ello hemos hecho una melodía que salta constantemente entre notas del acorde con un ritmo rápido y con muchas corcheas y semicorcheas seguidas para darle ese carácter juguetón.</w:t>
+      </w:r>
+    </w:p>
+    <w:p>
+      <w:pPr>
+        <w:rPr>
+          <w:sz w:val="32"/>
+          <w:szCs w:val="32"/>
+        </w:rPr>
+      </w:pPr>
+    </w:p>
+    <w:p>
+      <w:pPr>
+        <w:rPr>
+          <w:sz w:val="32"/>
+          <w:szCs w:val="32"/>
+        </w:rPr>
+      </w:pPr>
+      <w:r>
         <w:rPr>
           <w:b/>
           <w:bCs/>
           <w:sz w:val="32"/>
           <w:szCs w:val="32"/>
         </w:rPr>
-      </w:pPr>
-      <w:r>
+        <w:t>Estilos a adaptar</w:t>
+      </w:r>
+    </w:p>
+    <w:p>
+      <w:pPr>
+        <w:rPr>
+          <w:sz w:val="28"/>
+          <w:szCs w:val="28"/>
+        </w:rPr>
+      </w:pPr>
+      <w:r>
+        <w:rPr>
+          <w:sz w:val="28"/>
+          <w:szCs w:val="28"/>
+        </w:rPr>
+        <w:t>- Combate/tensión en distintas intensidades</w:t>
+      </w:r>
+    </w:p>
+    <w:p>
+      <w:pPr>
+        <w:rPr>
+          <w:sz w:val="28"/>
+          <w:szCs w:val="28"/>
+        </w:rPr>
+      </w:pPr>
+      <w:r>
+        <w:rPr>
+          <w:sz w:val="28"/>
+          <w:szCs w:val="28"/>
+        </w:rPr>
+        <w:t>- Selva tropical</w:t>
+      </w:r>
+    </w:p>
+    <w:p>
+      <w:pPr>
+        <w:rPr>
+          <w:sz w:val="28"/>
+          <w:szCs w:val="28"/>
+        </w:rPr>
+      </w:pPr>
+      <w:r>
+        <w:rPr>
+          <w:sz w:val="28"/>
+          <w:szCs w:val="28"/>
+        </w:rPr>
+        <w:t>- Espacial</w:t>
+      </w:r>
+    </w:p>
+    <w:p>
+      <w:pPr>
+        <w:rPr>
+          <w:sz w:val="28"/>
+          <w:szCs w:val="28"/>
+        </w:rPr>
+      </w:pPr>
+      <w:r>
+        <w:rPr>
+          <w:sz w:val="28"/>
+          <w:szCs w:val="28"/>
+        </w:rPr>
+        <w:t>- Bosque</w:t>
+      </w:r>
+    </w:p>
+    <w:p>
+      <w:pPr>
+        <w:rPr>
+          <w:sz w:val="32"/>
+          <w:szCs w:val="32"/>
+        </w:rPr>
+      </w:pPr>
+    </w:p>
+    <w:p>
+      <w:pPr>
         <w:rPr>
           <w:b/>
           <w:bCs/>
           <w:sz w:val="32"/>
           <w:szCs w:val="32"/>
         </w:rPr>
+      </w:pPr>
+      <w:r>
+        <w:rPr>
+          <w:b/>
+          <w:bCs/>
+          <w:sz w:val="32"/>
+          <w:szCs w:val="32"/>
+        </w:rPr>
         <w:t>Características de cada estilo</w:t>
       </w:r>
-    </w:p>
-    <w:p>
-      <w:pPr>
-        <w:rPr>
-          <w:sz w:val="32"/>
-          <w:szCs w:val="32"/>
-        </w:rPr>
-      </w:pPr>
     </w:p>
     <w:p>
       <w:pPr>
@@ -569,7 +534,7 @@
                     </pic:cNvPicPr>
                   </pic:nvPicPr>
                   <pic:blipFill>
-                    <a:blip r:embed="rId7" cstate="print">
+                    <a:blip r:embed="rId8" cstate="print">
                       <a:extLst>
                         <a:ext uri="{28A0092B-C50C-407E-A947-70E740481C1C}">
                           <a14:useLocalDpi xmlns:a14="http://schemas.microsoft.com/office/drawing/2010/main" val="0"/>
@@ -613,23 +578,108 @@
           <w:sz w:val="28"/>
           <w:szCs w:val="28"/>
         </w:rPr>
-        <w:t xml:space="preserve">- En un primer lugar para la composición de música de combate se ha usado como inspiración principalmente el trabajo de composición de </w:t>
-      </w:r>
+        <w:t xml:space="preserve">- En un primer lugar para la composición de música de combate se ha usado como inspiración principalmente el trabajo de composición de juegos RPG de PS2, sobre todo los compuestos por </w:t>
+      </w:r>
+      <w:proofErr w:type="spellStart"/>
+      <w:r>
+        <w:rPr>
+          <w:sz w:val="28"/>
+          <w:szCs w:val="28"/>
+        </w:rPr>
+        <w:t>Shoji</w:t>
+      </w:r>
+      <w:proofErr w:type="spellEnd"/>
+      <w:r>
+        <w:rPr>
+          <w:sz w:val="28"/>
+          <w:szCs w:val="28"/>
+        </w:rPr>
+        <w:t xml:space="preserve"> </w:t>
+      </w:r>
+      <w:proofErr w:type="spellStart"/>
+      <w:r>
+        <w:rPr>
+          <w:sz w:val="28"/>
+          <w:szCs w:val="28"/>
+        </w:rPr>
+        <w:t>Meguro</w:t>
+      </w:r>
+      <w:proofErr w:type="spellEnd"/>
+      <w:r>
+        <w:rPr>
+          <w:sz w:val="28"/>
+          <w:szCs w:val="28"/>
+        </w:rPr>
+        <w:t xml:space="preserve"> para la PS2.</w:t>
+      </w:r>
+    </w:p>
+    <w:p>
+      <w:pPr>
+        <w:rPr>
+          <w:sz w:val="28"/>
+          <w:szCs w:val="28"/>
+        </w:rPr>
+      </w:pPr>
+      <w:r>
+        <w:rPr>
+          <w:sz w:val="28"/>
+          <w:szCs w:val="28"/>
+        </w:rPr>
+        <w:t>- En estos temas de combate se suelen empezar con un riff repetitivo y simple que se va repitiendo durante el tema entero.</w:t>
+      </w:r>
+    </w:p>
+    <w:p>
+      <w:pPr>
+        <w:rPr>
+          <w:sz w:val="28"/>
+          <w:szCs w:val="28"/>
+        </w:rPr>
+      </w:pPr>
+      <w:r>
+        <w:rPr>
+          <w:sz w:val="28"/>
+          <w:szCs w:val="28"/>
+        </w:rPr>
+        <w:t>- Estos incluyen una fuerte melodía también a lo largo del tema.</w:t>
+      </w:r>
+    </w:p>
+    <w:p>
+      <w:pPr>
+        <w:rPr>
+          <w:sz w:val="28"/>
+          <w:szCs w:val="28"/>
+        </w:rPr>
+      </w:pPr>
       <w:r>
         <w:rPr>
           <w:sz w:val="28"/>
           <w:szCs w:val="28"/>
         </w:rPr>
         <w:lastRenderedPageBreak/>
-        <w:t xml:space="preserve">juegos RPG de PS2, sobre todo los compuestos por </w:t>
-      </w:r>
-      <w:proofErr w:type="spellStart"/>
-      <w:r>
-        <w:rPr>
-          <w:sz w:val="28"/>
-          <w:szCs w:val="28"/>
-        </w:rPr>
-        <w:t>Shoji</w:t>
+        <w:t>- En estos temas la intensidad aumenta a lo largo de la pieza, lentamente añadiendo nuevos elementos que poco a poco aumentan más y más ese sentimiento de tensión.</w:t>
+      </w:r>
+    </w:p>
+    <w:p>
+      <w:pPr>
+        <w:rPr>
+          <w:sz w:val="28"/>
+          <w:szCs w:val="28"/>
+        </w:rPr>
+      </w:pPr>
+      <w:r>
+        <w:rPr>
+          <w:sz w:val="28"/>
+          <w:szCs w:val="28"/>
+        </w:rPr>
+        <w:t>- Por ejemplo en el tema de [</w:t>
+      </w:r>
+      <w:proofErr w:type="spellStart"/>
+      <w:r>
+        <w:rPr>
+          <w:sz w:val="28"/>
+          <w:szCs w:val="28"/>
+        </w:rPr>
+        <w:t>Last</w:t>
       </w:r>
       <w:proofErr w:type="spellEnd"/>
       <w:r>
@@ -645,83 +695,7 @@
           <w:sz w:val="28"/>
           <w:szCs w:val="28"/>
         </w:rPr>
-        <w:t>Meguro</w:t>
-      </w:r>
-      <w:proofErr w:type="spellEnd"/>
-      <w:r>
-        <w:rPr>
-          <w:sz w:val="28"/>
-          <w:szCs w:val="28"/>
-        </w:rPr>
-        <w:t xml:space="preserve"> para la PS2.</w:t>
-      </w:r>
-    </w:p>
-    <w:p>
-      <w:pPr>
-        <w:rPr>
-          <w:sz w:val="28"/>
-          <w:szCs w:val="28"/>
-        </w:rPr>
-      </w:pPr>
-      <w:r>
-        <w:rPr>
-          <w:sz w:val="28"/>
-          <w:szCs w:val="28"/>
-        </w:rPr>
-        <w:t>- En estos temas de combate se suelen empezar con un riff repetitivo y simple que se va repitiendo durante el tema entero.</w:t>
-      </w:r>
-    </w:p>
-    <w:p>
-      <w:pPr>
-        <w:rPr>
-          <w:sz w:val="28"/>
-          <w:szCs w:val="28"/>
-        </w:rPr>
-      </w:pPr>
-      <w:r>
-        <w:rPr>
-          <w:sz w:val="28"/>
-          <w:szCs w:val="28"/>
-        </w:rPr>
-        <w:t>- Estos incluyen una fuerte melodía también a lo largo del tema.</w:t>
-      </w:r>
-    </w:p>
-    <w:p>
-      <w:pPr>
-        <w:rPr>
-          <w:sz w:val="28"/>
-          <w:szCs w:val="28"/>
-        </w:rPr>
-      </w:pPr>
-      <w:r>
-        <w:rPr>
-          <w:sz w:val="28"/>
-          <w:szCs w:val="28"/>
-        </w:rPr>
-        <w:t>- En estos temas la intensidad aumenta a lo largo de la pieza, lentamente añadiendo nuevos elementos que poco a poco aumentan más y más ese sentimiento de tensión.</w:t>
-      </w:r>
-    </w:p>
-    <w:p>
-      <w:pPr>
-        <w:rPr>
-          <w:sz w:val="28"/>
-          <w:szCs w:val="28"/>
-        </w:rPr>
-      </w:pPr>
-      <w:r>
-        <w:rPr>
-          <w:sz w:val="28"/>
-          <w:szCs w:val="28"/>
-        </w:rPr>
-        <w:t>- Por ejemplo en el tema de [</w:t>
-      </w:r>
-      <w:proofErr w:type="spellStart"/>
-      <w:r>
-        <w:rPr>
-          <w:sz w:val="28"/>
-          <w:szCs w:val="28"/>
-        </w:rPr>
-        <w:t>Last</w:t>
+        <w:t>Boss</w:t>
       </w:r>
       <w:proofErr w:type="spellEnd"/>
       <w:r>
@@ -737,7 +711,23 @@
           <w:sz w:val="28"/>
           <w:szCs w:val="28"/>
         </w:rPr>
-        <w:t>Boss</w:t>
+        <w:t>Battle</w:t>
+      </w:r>
+      <w:proofErr w:type="spellEnd"/>
+      <w:r>
+        <w:rPr>
+          <w:sz w:val="28"/>
+          <w:szCs w:val="28"/>
+        </w:rPr>
+        <w:t xml:space="preserve"> - </w:t>
+      </w:r>
+      <w:proofErr w:type="spellStart"/>
+      <w:r>
+        <w:rPr>
+          <w:sz w:val="28"/>
+          <w:szCs w:val="28"/>
+        </w:rPr>
+        <w:t>Before</w:t>
       </w:r>
       <w:proofErr w:type="spellEnd"/>
       <w:r>
@@ -748,28 +738,52 @@
         <w:t xml:space="preserve"> </w:t>
       </w:r>
       <w:proofErr w:type="spellStart"/>
-      <w:r>
-        <w:rPr>
-          <w:sz w:val="28"/>
-          <w:szCs w:val="28"/>
-        </w:rPr>
-        <w:t>Battle</w:t>
-      </w:r>
-      <w:proofErr w:type="spellEnd"/>
-      <w:r>
-        <w:rPr>
-          <w:sz w:val="28"/>
-          <w:szCs w:val="28"/>
-        </w:rPr>
-        <w:t xml:space="preserve"> - </w:t>
-      </w:r>
-      <w:proofErr w:type="spellStart"/>
-      <w:r>
-        <w:rPr>
-          <w:sz w:val="28"/>
-          <w:szCs w:val="28"/>
-        </w:rPr>
-        <w:t>Before</w:t>
+      <w:proofErr w:type="gramStart"/>
+      <w:r>
+        <w:rPr>
+          <w:sz w:val="28"/>
+          <w:szCs w:val="28"/>
+        </w:rPr>
+        <w:t>Transformation</w:t>
+      </w:r>
+      <w:proofErr w:type="spellEnd"/>
+      <w:r>
+        <w:rPr>
+          <w:sz w:val="28"/>
+          <w:szCs w:val="28"/>
+        </w:rPr>
+        <w:t xml:space="preserve"> ]</w:t>
+      </w:r>
+      <w:proofErr w:type="gramEnd"/>
+      <w:r>
+        <w:rPr>
+          <w:sz w:val="28"/>
+          <w:szCs w:val="28"/>
+        </w:rPr>
+        <w:t>(</w:t>
+      </w:r>
+      <w:r>
+        <w:rPr>
+          <w:sz w:val="28"/>
+          <w:szCs w:val="28"/>
+          <w:u w:val="single"/>
+        </w:rPr>
+        <w:t>https://www.youtube.com/watch?v=axUVAWoUzTY&amp;list=RDaxUVAWoUzTY&amp;start_radio=1</w:t>
+      </w:r>
+      <w:r>
+        <w:rPr>
+          <w:sz w:val="28"/>
+          <w:szCs w:val="28"/>
+        </w:rPr>
+        <w:t xml:space="preserve">) del </w:t>
+      </w:r>
+      <w:proofErr w:type="spellStart"/>
+      <w:r>
+        <w:rPr>
+          <w:sz w:val="28"/>
+          <w:szCs w:val="28"/>
+        </w:rPr>
+        <w:t>Shin</w:t>
       </w:r>
       <w:proofErr w:type="spellEnd"/>
       <w:r>
@@ -780,52 +794,12 @@
         <w:t xml:space="preserve"> </w:t>
       </w:r>
       <w:proofErr w:type="spellStart"/>
-      <w:proofErr w:type="gramStart"/>
-      <w:r>
-        <w:rPr>
-          <w:sz w:val="28"/>
-          <w:szCs w:val="28"/>
-        </w:rPr>
-        <w:t>Transformation</w:t>
-      </w:r>
-      <w:proofErr w:type="spellEnd"/>
-      <w:r>
-        <w:rPr>
-          <w:sz w:val="28"/>
-          <w:szCs w:val="28"/>
-        </w:rPr>
-        <w:t xml:space="preserve"> ]</w:t>
-      </w:r>
-      <w:proofErr w:type="gramEnd"/>
-      <w:r>
-        <w:rPr>
-          <w:sz w:val="28"/>
-          <w:szCs w:val="28"/>
-        </w:rPr>
-        <w:t>(</w:t>
-      </w:r>
-      <w:r>
-        <w:rPr>
-          <w:sz w:val="28"/>
-          <w:szCs w:val="28"/>
-          <w:u w:val="single"/>
-        </w:rPr>
-        <w:t>https://www.youtube.com/watch?v=axUVAWoUzTY&amp;list=RDaxUVAWoUzTY&amp;start_radio=1</w:t>
-      </w:r>
-      <w:r>
-        <w:rPr>
-          <w:sz w:val="28"/>
-          <w:szCs w:val="28"/>
-        </w:rPr>
-        <w:t xml:space="preserve">) del </w:t>
-      </w:r>
-      <w:proofErr w:type="spellStart"/>
-      <w:r>
-        <w:rPr>
-          <w:sz w:val="28"/>
-          <w:szCs w:val="28"/>
-        </w:rPr>
-        <w:t>Shin</w:t>
+      <w:r>
+        <w:rPr>
+          <w:sz w:val="28"/>
+          <w:szCs w:val="28"/>
+        </w:rPr>
+        <w:t>Megami</w:t>
       </w:r>
       <w:proofErr w:type="spellEnd"/>
       <w:r>
@@ -841,22 +815,6 @@
           <w:sz w:val="28"/>
           <w:szCs w:val="28"/>
         </w:rPr>
-        <w:t>Megami</w:t>
-      </w:r>
-      <w:proofErr w:type="spellEnd"/>
-      <w:r>
-        <w:rPr>
-          <w:sz w:val="28"/>
-          <w:szCs w:val="28"/>
-        </w:rPr>
-        <w:t xml:space="preserve"> </w:t>
-      </w:r>
-      <w:proofErr w:type="spellStart"/>
-      <w:r>
-        <w:rPr>
-          <w:sz w:val="28"/>
-          <w:szCs w:val="28"/>
-        </w:rPr>
         <w:t>Tensei</w:t>
       </w:r>
       <w:proofErr w:type="spellEnd"/>
@@ -1109,14 +1067,13 @@
           <w:szCs w:val="28"/>
         </w:rPr>
       </w:pPr>
-    </w:p>
-    <w:p>
-      <w:pPr>
-        <w:rPr>
-          <w:sz w:val="28"/>
-          <w:szCs w:val="28"/>
-        </w:rPr>
-      </w:pPr>
+      <w:r>
+        <w:rPr>
+          <w:sz w:val="28"/>
+          <w:szCs w:val="28"/>
+        </w:rPr>
+        <w:t>- Intenté bastante darle una cierta tensión, como si fuera un encuentro o combate especial, ya sea jefe en un juego RPG muy importante a la historia o un encuentro especial.</w:t>
+      </w:r>
     </w:p>
     <w:p>
       <w:pPr>
@@ -1146,7 +1103,6 @@
           <w:sz w:val="32"/>
           <w:szCs w:val="32"/>
         </w:rPr>
-        <w:lastRenderedPageBreak/>
         <w:t>Analisis</w:t>
       </w:r>
       <w:proofErr w:type="spellEnd"/>
@@ -1183,6 +1139,7 @@
           <w:szCs w:val="28"/>
           <w:lang w:eastAsia="es-ES"/>
         </w:rPr>
+        <w:lastRenderedPageBreak/>
         <w:drawing>
           <wp:inline distT="0" distB="0" distL="0" distR="0">
             <wp:extent cx="3009900" cy="3009900"/>
@@ -1201,7 +1158,7 @@
                     </pic:cNvPicPr>
                   </pic:nvPicPr>
                   <pic:blipFill>
-                    <a:blip r:embed="rId8">
+                    <a:blip r:embed="rId9">
                       <a:extLst>
                         <a:ext uri="{28A0092B-C50C-407E-A947-70E740481C1C}">
                           <a14:useLocalDpi xmlns:a14="http://schemas.microsoft.com/office/drawing/2010/main" val="0"/>
@@ -1338,29 +1295,22 @@
           <w:sz w:val="28"/>
           <w:szCs w:val="28"/>
         </w:rPr>
-        <w:t xml:space="preserve">" por su sonido parecido al de un mono, es un instrumento de percusión que se toca haciendo transmitir la vibración al frotar un palo en su interior hacia el parche del </w:t>
-      </w:r>
+        <w:t>" por su sonido parecido al de un mono, es un instrumento de percusión que se toca haciendo transmitir la vibración al frotar un palo en su interior hacia el parche del exterior, si haces presión sobre el parche puedes hacer que el sonido suene más o menos agudo.</w:t>
+      </w:r>
+    </w:p>
+    <w:p>
+      <w:pPr>
+        <w:rPr>
+          <w:sz w:val="28"/>
+          <w:szCs w:val="28"/>
+        </w:rPr>
+      </w:pPr>
       <w:r>
         <w:rPr>
           <w:sz w:val="28"/>
           <w:szCs w:val="28"/>
         </w:rPr>
         <w:lastRenderedPageBreak/>
-        <w:t>exterior, si haces presión sobre el parche puedes hacer que el sonido suene más o menos agudo.</w:t>
-      </w:r>
-    </w:p>
-    <w:p>
-      <w:pPr>
-        <w:rPr>
-          <w:sz w:val="28"/>
-          <w:szCs w:val="28"/>
-        </w:rPr>
-      </w:pPr>
-      <w:r>
-        <w:rPr>
-          <w:sz w:val="28"/>
-          <w:szCs w:val="28"/>
-        </w:rPr>
         <w:t xml:space="preserve">- Además se pueden ver instrumentos de cuerda frotada tocada con la técnica de </w:t>
       </w:r>
       <w:proofErr w:type="spellStart"/>
@@ -1472,7 +1422,7 @@
                     </pic:cNvPicPr>
                   </pic:nvPicPr>
                   <pic:blipFill>
-                    <a:blip r:embed="rId9" cstate="print">
+                    <a:blip r:embed="rId10" cstate="print">
                       <a:extLst>
                         <a:ext uri="{28A0092B-C50C-407E-A947-70E740481C1C}">
                           <a14:useLocalDpi xmlns:a14="http://schemas.microsoft.com/office/drawing/2010/main" val="0"/>
@@ -1515,30 +1465,50 @@
     <w:p>
       <w:pPr>
         <w:rPr>
-          <w:b/>
+          <w:sz w:val="28"/>
+          <w:szCs w:val="28"/>
+        </w:rPr>
+      </w:pPr>
+    </w:p>
+    <w:p>
+      <w:pPr>
+        <w:rPr>
           <w:bCs/>
-          <w:sz w:val="32"/>
-          <w:szCs w:val="32"/>
-        </w:rPr>
-      </w:pPr>
-    </w:p>
-    <w:p>
-      <w:pPr>
-        <w:rPr>
-          <w:b/>
+          <w:sz w:val="28"/>
+          <w:szCs w:val="28"/>
+        </w:rPr>
+      </w:pPr>
+      <w:r>
+        <w:rPr>
           <w:bCs/>
-          <w:sz w:val="32"/>
-          <w:szCs w:val="32"/>
-        </w:rPr>
-      </w:pPr>
-    </w:p>
-    <w:p>
-      <w:pPr>
-        <w:rPr>
-          <w:b/>
+          <w:sz w:val="28"/>
+          <w:szCs w:val="28"/>
+        </w:rPr>
+        <w:t>- Para el resultado final decidí utilizar mari</w:t>
+      </w:r>
+      <w:r>
+        <w:rPr>
           <w:bCs/>
-          <w:sz w:val="32"/>
-          <w:szCs w:val="32"/>
+          <w:sz w:val="28"/>
+          <w:szCs w:val="28"/>
+        </w:rPr>
+        <w:t>m</w:t>
+      </w:r>
+      <w:r>
+        <w:rPr>
+          <w:bCs/>
+          <w:sz w:val="28"/>
+          <w:szCs w:val="28"/>
+        </w:rPr>
+        <w:t>bas para poder dar ese tono de madera a la melodía y su acompañamiento, además de usar bongós y una cuica para el apartado rítmico, en el apartado musical he empleado bastante el Swing. Además, he añadido reverberación para dar la sensación de amplitud de la selva.  </w:t>
+      </w:r>
+    </w:p>
+    <w:p>
+      <w:pPr>
+        <w:rPr>
+          <w:bCs/>
+          <w:sz w:val="28"/>
+          <w:szCs w:val="28"/>
         </w:rPr>
       </w:pPr>
     </w:p>
@@ -1598,7 +1568,7 @@
                     </pic:cNvPicPr>
                   </pic:nvPicPr>
                   <pic:blipFill>
-                    <a:blip r:embed="rId10">
+                    <a:blip r:embed="rId11">
                       <a:extLst>
                         <a:ext uri="{28A0092B-C50C-407E-A947-70E740481C1C}">
                           <a14:useLocalDpi xmlns:a14="http://schemas.microsoft.com/office/drawing/2010/main" val="0"/>
@@ -1808,8 +1778,39 @@
     <w:p>
       <w:pPr>
         <w:rPr>
-          <w:sz w:val="32"/>
-          <w:szCs w:val="32"/>
+          <w:sz w:val="28"/>
+          <w:szCs w:val="28"/>
+        </w:rPr>
+      </w:pPr>
+      <w:r>
+        <w:rPr>
+          <w:sz w:val="28"/>
+          <w:szCs w:val="28"/>
+        </w:rPr>
+        <w:t>- Para la composición final he utilizado una flauta de pan para darle una sonoridad a bosque denso con mucho aire, para el acompañamiento he usado una lira (</w:t>
+      </w:r>
+      <w:proofErr w:type="spellStart"/>
+      <w:r>
+        <w:rPr>
+          <w:sz w:val="28"/>
+          <w:szCs w:val="28"/>
+        </w:rPr>
+        <w:t>glockenspiel</w:t>
+      </w:r>
+      <w:proofErr w:type="spellEnd"/>
+      <w:r>
+        <w:rPr>
+          <w:sz w:val="28"/>
+          <w:szCs w:val="28"/>
+        </w:rPr>
+        <w:t>) para darle ese sonido metálico y mágico, por último, cuando aparece el leitmotiv lo hace acompañado de una celesta, instrumento por excelencia para representar la magia, el ritme es mucho más calmado y suave que en la composición de jungla.</w:t>
+      </w:r>
+    </w:p>
+    <w:p>
+      <w:pPr>
+        <w:rPr>
+          <w:sz w:val="28"/>
+          <w:szCs w:val="28"/>
         </w:rPr>
       </w:pPr>
     </w:p>
@@ -1899,7 +1900,7 @@
                     </pic:cNvPicPr>
                   </pic:nvPicPr>
                   <pic:blipFill>
-                    <a:blip r:embed="rId11" cstate="print">
+                    <a:blip r:embed="rId12" cstate="print">
                       <a:extLst>
                         <a:ext uri="{28A0092B-C50C-407E-A947-70E740481C1C}">
                           <a14:useLocalDpi xmlns:a14="http://schemas.microsoft.com/office/drawing/2010/main" val="0"/>
@@ -2048,7 +2049,15 @@
           <w:sz w:val="28"/>
           <w:szCs w:val="28"/>
         </w:rPr>
-        <w:t xml:space="preserve"> de 3/4 el cual es común en los valses y el cual se usa también en el tema de bajo agua del </w:t>
+        <w:t xml:space="preserve"> de 3/4 el cual es común en los valses y </w:t>
+      </w:r>
+      <w:r>
+        <w:rPr>
+          <w:sz w:val="28"/>
+          <w:szCs w:val="28"/>
+        </w:rPr>
+        <w:lastRenderedPageBreak/>
+        <w:t xml:space="preserve">el cual se usa también en el tema de bajo agua del </w:t>
       </w:r>
       <w:proofErr w:type="spellStart"/>
       <w:r>
@@ -2094,8 +2103,60 @@
           <w:sz w:val="28"/>
           <w:szCs w:val="28"/>
         </w:rPr>
-        <w:lastRenderedPageBreak/>
         <w:t>- En cuanto a la composición final el tema está en D lidio con un BPM de 70 y un compás de 3/4</w:t>
+      </w:r>
+      <w:r>
+        <w:rPr>
+          <w:sz w:val="28"/>
+          <w:szCs w:val="28"/>
+        </w:rPr>
+        <w:t>.</w:t>
+      </w:r>
+    </w:p>
+    <w:p>
+      <w:pPr>
+        <w:rPr>
+          <w:sz w:val="28"/>
+          <w:szCs w:val="28"/>
+        </w:rPr>
+      </w:pPr>
+      <w:r>
+        <w:rPr>
+          <w:sz w:val="28"/>
+          <w:szCs w:val="28"/>
+        </w:rPr>
+        <w:t xml:space="preserve">- Todos los instrumentos de esta pieza son Sintetizadores y se ha usado exclusivamente Vital Audio para la composición. He intentado usar tanto </w:t>
+      </w:r>
+      <w:proofErr w:type="spellStart"/>
+      <w:r>
+        <w:rPr>
+          <w:sz w:val="28"/>
+          <w:szCs w:val="28"/>
+        </w:rPr>
+        <w:t>presets</w:t>
+      </w:r>
+      <w:proofErr w:type="spellEnd"/>
+      <w:r>
+        <w:rPr>
+          <w:sz w:val="28"/>
+          <w:szCs w:val="28"/>
+        </w:rPr>
+        <w:t xml:space="preserve"> como instrumentos que me hice yo misma más instrumentos defaults que he modificado para obtener los sonidos futuristas de un espacio el cual es bastante vacío.</w:t>
+      </w:r>
+    </w:p>
+    <w:p>
+      <w:pPr>
+        <w:rPr>
+          <w:sz w:val="28"/>
+          <w:szCs w:val="28"/>
+        </w:rPr>
+      </w:pPr>
+      <w:r>
+        <w:rPr>
+          <w:sz w:val="28"/>
+          <w:szCs w:val="28"/>
+        </w:rPr>
+        <w:t>- También intenté darle un toque algo melancólico y ambiental para resaltar el frio y vacío espacial.</w:t>
       </w:r>
     </w:p>
     <w:p>
@@ -2126,14 +2187,6 @@
     <w:p>
       <w:pPr>
         <w:rPr>
-          <w:sz w:val="32"/>
-          <w:szCs w:val="32"/>
-        </w:rPr>
-      </w:pPr>
-    </w:p>
-    <w:p>
-      <w:pPr>
-        <w:rPr>
           <w:sz w:val="28"/>
           <w:szCs w:val="28"/>
         </w:rPr>
@@ -2152,7 +2205,7 @@
         </w:rPr>
         <w:t xml:space="preserve"> </w:t>
       </w:r>
-      <w:hyperlink r:id="rId12" w:history="1">
+      <w:hyperlink r:id="rId13" w:history="1">
         <w:proofErr w:type="spellStart"/>
         <w:r>
           <w:rPr>
@@ -2160,23 +2213,7 @@
             <w:sz w:val="28"/>
             <w:szCs w:val="28"/>
           </w:rPr>
-          <w:t>Ludofon</w:t>
-        </w:r>
-        <w:r>
-          <w:rPr>
-            <w:rStyle w:val="Hipervnculo"/>
-            <w:sz w:val="28"/>
-            <w:szCs w:val="28"/>
-          </w:rPr>
-          <w:t>í</w:t>
-        </w:r>
-        <w:r>
-          <w:rPr>
-            <w:rStyle w:val="Hipervnculo"/>
-            <w:sz w:val="28"/>
-            <w:szCs w:val="28"/>
-          </w:rPr>
-          <w:t>a</w:t>
+          <w:t>Ludofonía</w:t>
         </w:r>
         <w:proofErr w:type="spellEnd"/>
       </w:hyperlink>
@@ -2209,7 +2246,7 @@
         </w:rPr>
         <w:t xml:space="preserve"> </w:t>
       </w:r>
-      <w:hyperlink r:id="rId13" w:history="1">
+      <w:hyperlink r:id="rId14" w:history="1">
         <w:r>
           <w:rPr>
             <w:rStyle w:val="Hipervnculo"/>
@@ -2259,7 +2296,7 @@
         </w:rPr>
         <w:t xml:space="preserve"> </w:t>
       </w:r>
-      <w:hyperlink r:id="rId14" w:history="1">
+      <w:hyperlink r:id="rId15" w:history="1">
         <w:r>
           <w:rPr>
             <w:rStyle w:val="Hipervnculo"/>
@@ -2291,7 +2328,7 @@
         </w:rPr>
         <w:t xml:space="preserve"> </w:t>
       </w:r>
-      <w:hyperlink r:id="rId15" w:history="1">
+      <w:hyperlink r:id="rId16" w:history="1">
         <w:r>
           <w:rPr>
             <w:rStyle w:val="Hipervnculo"/>
@@ -2323,7 +2360,7 @@
         </w:rPr>
         <w:t xml:space="preserve"> </w:t>
       </w:r>
-      <w:hyperlink r:id="rId16" w:history="1">
+      <w:hyperlink r:id="rId17" w:history="1">
         <w:proofErr w:type="spellStart"/>
         <w:r>
           <w:rPr>
@@ -2365,7 +2402,7 @@
         </w:rPr>
         <w:t xml:space="preserve"> </w:t>
       </w:r>
-      <w:hyperlink r:id="rId17" w:history="1">
+      <w:hyperlink r:id="rId18" w:history="1">
         <w:r>
           <w:rPr>
             <w:rStyle w:val="Hipervnculo"/>
@@ -2401,7 +2438,7 @@
           <w:szCs w:val="28"/>
         </w:rPr>
       </w:pPr>
-      <w:hyperlink r:id="rId18" w:history="1">
+      <w:hyperlink r:id="rId19" w:history="1">
         <w:r>
           <w:rPr>
             <w:rStyle w:val="Hipervnculo"/>
@@ -2429,7 +2466,7 @@
           <w:szCs w:val="28"/>
         </w:rPr>
       </w:pPr>
-      <w:hyperlink r:id="rId19" w:history="1">
+      <w:hyperlink r:id="rId20" w:history="1">
         <w:r>
           <w:rPr>
             <w:rStyle w:val="Hipervnculo"/>
@@ -2511,7 +2548,7 @@
           <w:szCs w:val="28"/>
         </w:rPr>
       </w:pPr>
-      <w:hyperlink r:id="rId20" w:history="1">
+      <w:hyperlink r:id="rId21" w:history="1">
         <w:r>
           <w:rPr>
             <w:rStyle w:val="Hipervnculo"/>
@@ -2539,7 +2576,7 @@
           <w:szCs w:val="28"/>
         </w:rPr>
       </w:pPr>
-      <w:hyperlink r:id="rId21" w:history="1">
+      <w:hyperlink r:id="rId22" w:history="1">
         <w:r>
           <w:rPr>
             <w:rStyle w:val="Hipervnculo"/>
@@ -2557,7 +2594,7 @@
           <w:szCs w:val="28"/>
         </w:rPr>
       </w:pPr>
-      <w:hyperlink r:id="rId22" w:history="1">
+      <w:hyperlink r:id="rId23" w:history="1">
         <w:r>
           <w:rPr>
             <w:rStyle w:val="Hipervnculo"/>
@@ -2575,7 +2612,7 @@
           <w:szCs w:val="28"/>
         </w:rPr>
       </w:pPr>
-      <w:hyperlink r:id="rId23" w:history="1">
+      <w:hyperlink r:id="rId24" w:history="1">
         <w:r>
           <w:rPr>
             <w:rStyle w:val="Hipervnculo"/>
@@ -2593,7 +2630,7 @@
           <w:szCs w:val="28"/>
         </w:rPr>
       </w:pPr>
-      <w:hyperlink r:id="rId24" w:history="1">
+      <w:hyperlink r:id="rId25" w:history="1">
         <w:r>
           <w:rPr>
             <w:rStyle w:val="Hipervnculo"/>
@@ -2729,7 +2766,7 @@
           <w:szCs w:val="28"/>
         </w:rPr>
       </w:pPr>
-      <w:hyperlink r:id="rId25" w:history="1">
+      <w:hyperlink r:id="rId26" w:history="1">
         <w:r>
           <w:rPr>
             <w:rStyle w:val="Hipervnculo"/>
@@ -2851,7 +2888,7 @@
         </w:rPr>
         <w:t xml:space="preserve"> </w:t>
       </w:r>
-      <w:hyperlink r:id="rId26" w:history="1">
+      <w:hyperlink r:id="rId27" w:history="1">
         <w:proofErr w:type="spellStart"/>
         <w:r>
           <w:rPr>
@@ -2957,7 +2994,7 @@
         </w:rPr>
         <w:t xml:space="preserve"> </w:t>
       </w:r>
-      <w:hyperlink r:id="rId27" w:history="1">
+      <w:hyperlink r:id="rId28" w:history="1">
         <w:proofErr w:type="spellStart"/>
         <w:r>
           <w:rPr>
@@ -3075,7 +3112,7 @@
           <w:szCs w:val="28"/>
         </w:rPr>
       </w:pPr>
-      <w:hyperlink r:id="rId28" w:history="1">
+      <w:hyperlink r:id="rId29" w:history="1">
         <w:r>
           <w:rPr>
             <w:rStyle w:val="Hipervnculo"/>
@@ -3103,30 +3140,6 @@
           <w:t xml:space="preserve"> sobre el espacio</w:t>
         </w:r>
       </w:hyperlink>
-    </w:p>
-    <w:p>
-      <w:pPr>
-        <w:rPr>
-          <w:sz w:val="32"/>
-          <w:szCs w:val="32"/>
-        </w:rPr>
-      </w:pPr>
-    </w:p>
-    <w:p>
-      <w:pPr>
-        <w:rPr>
-          <w:sz w:val="32"/>
-          <w:szCs w:val="32"/>
-        </w:rPr>
-      </w:pPr>
-    </w:p>
-    <w:p>
-      <w:pPr>
-        <w:rPr>
-          <w:sz w:val="32"/>
-          <w:szCs w:val="32"/>
-        </w:rPr>
-      </w:pPr>
     </w:p>
     <w:p>
       <w:pPr>
@@ -3151,7 +3164,6 @@
           <w:sz w:val="32"/>
           <w:szCs w:val="32"/>
         </w:rPr>
-        <w:lastRenderedPageBreak/>
         <w:t>Plugins</w:t>
       </w:r>
       <w:proofErr w:type="spellEnd"/>
@@ -3168,14 +3180,6 @@
     <w:p>
       <w:pPr>
         <w:rPr>
-          <w:sz w:val="32"/>
-          <w:szCs w:val="32"/>
-        </w:rPr>
-      </w:pPr>
-    </w:p>
-    <w:p>
-      <w:pPr>
-        <w:rPr>
           <w:sz w:val="28"/>
           <w:szCs w:val="28"/>
         </w:rPr>
@@ -3194,7 +3198,7 @@
         </w:rPr>
         <w:t xml:space="preserve"> </w:t>
       </w:r>
-      <w:hyperlink r:id="rId29" w:anchor="getvital" w:history="1">
+      <w:hyperlink r:id="rId30" w:anchor="getvital" w:history="1">
         <w:r>
           <w:rPr>
             <w:rStyle w:val="Hipervnculo"/>
@@ -3226,7 +3230,7 @@
         </w:rPr>
         <w:t xml:space="preserve"> </w:t>
       </w:r>
-      <w:hyperlink r:id="rId30" w:history="1">
+      <w:hyperlink r:id="rId31" w:history="1">
         <w:proofErr w:type="spellStart"/>
         <w:r>
           <w:rPr>
@@ -3260,7 +3264,7 @@
         </w:rPr>
         <w:t xml:space="preserve"> </w:t>
       </w:r>
-      <w:hyperlink r:id="rId31" w:history="1">
+      <w:hyperlink r:id="rId32" w:history="1">
         <w:proofErr w:type="spellStart"/>
         <w:r>
           <w:rPr>
@@ -3294,7 +3298,7 @@
         </w:rPr>
         <w:t xml:space="preserve"> </w:t>
       </w:r>
-      <w:hyperlink r:id="rId32" w:history="1">
+      <w:hyperlink r:id="rId33" w:history="1">
         <w:proofErr w:type="spellStart"/>
         <w:r>
           <w:rPr>
@@ -3328,7 +3332,7 @@
         </w:rPr>
         <w:t xml:space="preserve"> </w:t>
       </w:r>
-      <w:hyperlink r:id="rId33" w:history="1">
+      <w:hyperlink r:id="rId34" w:history="1">
         <w:r>
           <w:rPr>
             <w:rStyle w:val="Hipervnculo"/>
@@ -3346,7 +3350,7 @@
           <w:szCs w:val="28"/>
         </w:rPr>
       </w:pPr>
-      <w:hyperlink r:id="rId34" w:history="1">
+      <w:hyperlink r:id="rId35" w:history="1">
         <w:r>
           <w:rPr>
             <w:rStyle w:val="Hipervnculo"/>
@@ -3392,7 +3396,7 @@
           <w:szCs w:val="28"/>
         </w:rPr>
       </w:pPr>
-      <w:hyperlink r:id="rId35" w:history="1">
+      <w:hyperlink r:id="rId36" w:history="1">
         <w:r>
           <w:rPr>
             <w:rStyle w:val="Hipervnculo"/>
@@ -3430,8 +3434,6 @@
         </w:r>
         <w:proofErr w:type="spellEnd"/>
       </w:hyperlink>
-      <w:bookmarkStart w:id="0" w:name="_GoBack"/>
-      <w:bookmarkEnd w:id="0"/>
     </w:p>
     <w:p>
       <w:pPr>
@@ -3450,7 +3452,7 @@
       </w:pPr>
     </w:p>
     <w:sectPr>
-      <w:headerReference w:type="default" r:id="rId36"/>
+      <w:headerReference w:type="default" r:id="rId37"/>
       <w:pgSz w:w="11906" w:h="16838"/>
       <w:pgMar w:top="1417" w:right="1701" w:bottom="1417" w:left="1701" w:header="708" w:footer="708" w:gutter="0"/>
       <w:cols w:space="708"/>

</xml_diff>